<commit_message>
update y correcciones paper
</commit_message>
<xml_diff>
--- a/TP_Final_VxC2_PaperVF_new_labeling.docx
+++ b/TP_Final_VxC2_PaperVF_new_labeling.docx
@@ -85,7 +85,7 @@
         <w:rPr>
           <w:rtl w:val="0"/>
         </w:rPr>
-        <w:t xml:space="preserve">La separación manual de residuos reciclables es un proceso lento y propenso a errores en plantas de tratamiento. Este trabajo propone un sistema de segmentación de instancias basado en YOLOv8-seg, entrenado mediante transfer learning en dos etapas sobre el dataset TACO (Trash Annotations in Context), para identificar y localizar seis categorías de residuos (plástico, papel/cartón, vidrio, metal, orgánico y otros) y asignarles el color de contenedor de reciclaje correspondiente. Se abordaron desafíos prácticos de reproducibilidad (enlaces de descarga caídos en el dataset original, resueltos mediante un mirror alternativo), balance de clases (mediante un split estratificado), limitaciones de memoria en hardware de consumo (Apple Silicon) y calidad del etiquetado (agrupando las categorías finas por material y no por supercategoría). El modelo final alcanzó un mAP50 (máscara) de 0.262 y un mAP50-95 de 0.181 sobre el conjunto de validación, resultados comparables en orden de magnitud a los reportados por los autores originales de TACO utilizando Mask R-CNN (AP=19.4). Se identificaron limitaciones relacionadas con la escasez de instancias en ciertas clases y con un efecto de cambio de dominio al evaluar sobre imágenes fuera del contexto de entrenamiento.</w:t>
+        <w:t xml:space="preserve">La separación manual de residuos reciclables es un proceso lento y propenso a errores en plantas de tratamiento. Este trabajo propone un sistema de segmentación de instancias basado en YOLOv8-seg, entrenado mediante transfer learning en dos etapas sobre el dataset TACO (Trash Annotations in Context), para identificar y localizar seis categorías de residuos (plástico, papel/cartón, vidrio, metal, orgánico y otros) y asignarles el color de contenedor de reciclaje correspondiente. Se abordaron desafíos prácticos de reproducibilidad (enlaces de descarga caídos en el dataset original, resueltos mediante un mirror alternativo), balance de clases (mediante un split estratificado), limitaciones de memoria en hardware de consumo (Google Colab, NVIDIA T4) y calidad del etiquetado (agrupando las categorías finas por material y no por supercategoría). El modelo final alcanzó un mAP50 (máscara) de 0.262 y un mAP50-95 de 0.181 sobre el conjunto de validación, resultados comparables en orden de magnitud a los reportados por los autores originales de TACO utilizando Mask R-CNN (AP=19.4). Se identificaron limitaciones relacionadas con la escasez de instancias en ciertas clases y con un efecto de cambio de dominio al evaluar sobre imágenes fuera del contexto de entrenamiento.</w:t>
       </w:r>
     </w:p>
     <w:p>
@@ -1148,7 +1148,7 @@
         <w:rPr>
           <w:rtl w:val="0"/>
         </w:rPr>
-        <w:t xml:space="preserve">Se aplicó fine-tuning en dos etapas: (Etapa 1) backbone congelado, en la que se entrenan únicamente las capas de detección y segmentación con un learning rate elevado; (Etapa 2) descongelamiento parcial del backbone, con un learning rate reducido, para lograr un ajuste fino de las características al dominio de residuos. Esta estrategia busca evitar que los gradientes de las capas nuevas, inicializadas aleatoriamente, distorsionen las características pre-entrenadas antes de que el modelo se estabilice.</w:t>
+        <w:t xml:space="preserve">Se aplicó fine-tuning en dos etapas: (Etapa 1) backbone congelado (capas 0–9), entrenando el neck y la cabeza de segmentación con un learning rate de 1e-3; (Etapa 2) descongelamiento parcial del backbone (se mantienen congeladas solo las capas 0–4), con un learning rate reducido de 3e-4, para ajustar las características de nivel medio y alto al dominio de residuos. Esta estrategia busca evitar que los gradientes de las capas de clasificación reinicializadas (6 clases en lugar de las 80 de COCO) distorsionen las características pre-entrenadas antes de que el modelo se estabilice.</w:t>
       </w:r>
     </w:p>
     <w:p>
@@ -1162,7 +1162,7 @@
         <w:rPr>
           <w:rtl w:val="0"/>
         </w:rPr>
-        <w:t xml:space="preserve">La exploración de configuraciones se realizó en una Mac con procesador Apple M4 Pro (aceleración MPS). Se identificó que, al descongelar completamente el backbone (freeze=None) junto con una resolución de entrada elevada (960 px) y un batch size de 16, el consumo de memoria unificada superaba la capacidad disponible. Esto generó uso de memoria de intercambio (swap) y una caída de rendimiento de aproximadamente 100 veces, de 1.5 segundos por iteración a 160 segundos por iteración. Como primera alternativa, se redujo la resolución de entrada a 640 px manteniendo el backbone completamente descongelado, lo que permitió completar el entrenamiento sin problemas de memoria, aunque con un desempeño inferior al de la Etapa 1 (mAP50 de 0.205 frente a 0.226). Esto motivó una segunda alternativa, consistente en recuperar la resolución de 960 px combinada con un congelamiento parcial de capas (5 de 10) en lugar de un descongelamiento completo, junto con una reducción del batch size a 4, lo que permitió mantener la resolución de entrada elevada sin comprometer la velocidad de entrenamiento y resultó en el mejor desempeño global obtenido. Se aplicó, además, data augmentation mediante mosaic, copy-paste y mixup, técnicas provistas por el framework Ultralytics [3] orientadas a mitigar el desbalance de clases mediante la síntesis de combinaciones nuevas de objetos entre imágenes. Dicha exploración utilizó una versión preliminar del agrupamiento de clases (por supercategoría); el modelo final se reentrenó con la configuración seleccionada y el mapeo por categoría fina en una GPU NVIDIA T4 (Google Colab).</w:t>
+        <w:t xml:space="preserve">El entrenamiento y la exploración de configuraciones se realizaron en Google Colab, sobre una GPU NVIDIA T4 con 16 GB de memoria. Se identificó que, al descongelar completamente el backbone (freeze=None) junto con una resolución de entrada elevada (960 px) y un batch size de 16, el consumo de memoria superaba la capacidad de la GPU. Como primera alternativa, se redujo la resolución de entrada a 640 px manteniendo el backbone completamente descongelado, lo que permitió completar el entrenamiento sin problemas de memoria, aunque con un desempeño inferior al de la Etapa 1 (mAP50 de 0.205 frente a 0.226). Esto motivó una segunda alternativa, consistente en recuperar la resolución de 960 px combinada con un congelamiento parcial de capas (5 de 10) en lugar de un descongelamiento completo, junto con una reducción del batch size a 4, lo que permitió mantener la resolución de entrada elevada dentro de la memoria disponible y resultó en el mejor desempeño global obtenido. Se aplicó, además, data augmentation mediante mosaic, copy-paste y mixup, técnicas provistas por el framework Ultralytics [3] orientadas a mitigar el desbalance de clases mediante la síntesis de combinaciones nuevas de objetos entre imágenes. Dicha exploración utilizó una versión preliminar del agrupamiento de clases (por supercategoría); el modelo final se reentrenó con la configuración seleccionada y el mapeo por categoría fina.</w:t>
       </w:r>
     </w:p>
     <w:p>
@@ -3703,7 +3703,7 @@
       </w:pPr>
       <w:sdt>
         <w:sdtPr>
-          <w:id w:val="1752901176"/>
+          <w:id w:val="-795367015"/>
           <w:tag w:val="goog_rdk_0"/>
         </w:sdtPr>
         <w:sdtContent>
@@ -4491,7 +4491,7 @@
         <w:rPr>
           <w:rtl w:val="0"/>
         </w:rPr>
-        <w:t xml:space="preserve">7) Las limitaciones de memoria del hardware de consumo condicionaron decisiones de diseño del entrenamiento. El uso de una GPU integrada, con memoria unificada, propia de arquitecturas Apple Silicon, impuso restricciones concretas sobre la combinación viable de resolución, tamaño de batch y capas entrenables, un factor relevante para considerar en proyectos con recursos computacionales limitados.</w:t>
+        <w:t xml:space="preserve">7) Las limitaciones de memoria del hardware de consumo condicionaron decisiones de diseño del entrenamiento. El uso de una GPU gratuita de 16 GB (NVIDIA T4 en Google Colab) impuso restricciones concretas sobre la combinación viable de resolución, tamaño de batch y capas entrenables, un factor relevante para considerar en proyectos con recursos computacionales limitados.</w:t>
       </w:r>
     </w:p>
     <w:p>

</xml_diff>